<commit_message>
Add Vercel + Render deployment decision to DECISION_LOG
Explains why we chose split hosting:
- Vercel for React frontend (CDN, instant deploys)
- Render for Flask backend (SSE support, persistent processes)
- Why single platform doesn't work (serverless timeouts)
</commit_message>
<xml_diff>
--- a/docs/DECISION_LOG.docx
+++ b/docs/DECISION_LOG.docx
@@ -1094,6 +1094,548 @@
     </w:p>
     <w:p/>
     <w:p>
+      <w:pPr>
+        <w:pStyle w:val="Heading3"/>
+      </w:pPr>
+      <w:r>
+        <w:t>Why Vercel (Frontend) + Render (Backend)?</w:t>
+      </w:r>
+    </w:p>
+    <w:p/>
+    <w:p>
+      <w:r>
+        <w:t>The Challenge: We needed separate hosting for React frontend and Flask backend because:</w:t>
+      </w:r>
+    </w:p>
+    <w:p>
+      <w:pPr>
+        <w:pStyle w:val="ListNumber"/>
+      </w:pPr>
+      <w:r>
+        <w:t>Flask requires a Python runtime (not static hosting)</w:t>
+      </w:r>
+    </w:p>
+    <w:p>
+      <w:pPr>
+        <w:pStyle w:val="ListNumber"/>
+      </w:pPr>
+      <w:r>
+        <w:t>SSE streaming needs long-lived connections</w:t>
+      </w:r>
+    </w:p>
+    <w:p>
+      <w:pPr>
+        <w:pStyle w:val="ListNumber"/>
+      </w:pPr>
+      <w:r>
+        <w:t>Free tier must support hackathon demo traffic</w:t>
+      </w:r>
+    </w:p>
+    <w:p/>
+    <w:p>
+      <w:r>
+        <w:t>Options Considered:</w:t>
+      </w:r>
+    </w:p>
+    <w:p/>
+    <w:tbl>
+      <w:tblPr>
+        <w:tblStyle w:val="TableGrid"/>
+        <w:tblW w:type="auto" w:w="0"/>
+        <w:tblLook w:firstColumn="1" w:firstRow="1" w:lastColumn="0" w:lastRow="0" w:noHBand="0" w:noVBand="1" w:val="04A0"/>
+      </w:tblPr>
+      <w:tblGrid>
+        <w:gridCol w:w="1728"/>
+        <w:gridCol w:w="1728"/>
+        <w:gridCol w:w="1728"/>
+        <w:gridCol w:w="1728"/>
+        <w:gridCol w:w="1728"/>
+      </w:tblGrid>
+      <w:tr>
+        <w:tc>
+          <w:tcPr>
+            <w:tcW w:type="dxa" w:w="1728"/>
+          </w:tcPr>
+          <w:p>
+            <w:r>
+              <w:t>Platform</w:t>
+            </w:r>
+          </w:p>
+        </w:tc>
+        <w:tc>
+          <w:tcPr>
+            <w:tcW w:type="dxa" w:w="1728"/>
+          </w:tcPr>
+          <w:p>
+            <w:r>
+              <w:t>Frontend</w:t>
+            </w:r>
+          </w:p>
+        </w:tc>
+        <w:tc>
+          <w:tcPr>
+            <w:tcW w:type="dxa" w:w="1728"/>
+          </w:tcPr>
+          <w:p>
+            <w:r>
+              <w:t>Backend</w:t>
+            </w:r>
+          </w:p>
+        </w:tc>
+        <w:tc>
+          <w:tcPr>
+            <w:tcW w:type="dxa" w:w="1728"/>
+          </w:tcPr>
+          <w:p>
+            <w:r>
+              <w:t>SSE Support</w:t>
+            </w:r>
+          </w:p>
+        </w:tc>
+        <w:tc>
+          <w:tcPr>
+            <w:tcW w:type="dxa" w:w="1728"/>
+          </w:tcPr>
+          <w:p>
+            <w:r>
+              <w:t>Free Tier</w:t>
+            </w:r>
+          </w:p>
+        </w:tc>
+      </w:tr>
+      <w:tr>
+        <w:tc>
+          <w:tcPr>
+            <w:tcW w:type="dxa" w:w="1728"/>
+          </w:tcPr>
+          <w:p>
+            <w:r>
+              <w:t>Vercel</w:t>
+            </w:r>
+          </w:p>
+        </w:tc>
+        <w:tc>
+          <w:tcPr>
+            <w:tcW w:type="dxa" w:w="1728"/>
+          </w:tcPr>
+          <w:p>
+            <w:r>
+              <w:t>Excellent</w:t>
+            </w:r>
+          </w:p>
+        </w:tc>
+        <w:tc>
+          <w:tcPr>
+            <w:tcW w:type="dxa" w:w="1728"/>
+          </w:tcPr>
+          <w:p>
+            <w:r>
+              <w:t>Limited (serverless timeout)</w:t>
+            </w:r>
+          </w:p>
+        </w:tc>
+        <w:tc>
+          <w:tcPr>
+            <w:tcW w:type="dxa" w:w="1728"/>
+          </w:tcPr>
+          <w:p>
+            <w:r>
+              <w:t>Poor</w:t>
+            </w:r>
+          </w:p>
+        </w:tc>
+        <w:tc>
+          <w:tcPr>
+            <w:tcW w:type="dxa" w:w="1728"/>
+          </w:tcPr>
+          <w:p>
+            <w:r>
+              <w:t>Generous</w:t>
+            </w:r>
+          </w:p>
+        </w:tc>
+      </w:tr>
+      <w:tr>
+        <w:tc>
+          <w:tcPr>
+            <w:tcW w:type="dxa" w:w="1728"/>
+          </w:tcPr>
+          <w:p>
+            <w:r>
+              <w:t>Render</w:t>
+            </w:r>
+          </w:p>
+        </w:tc>
+        <w:tc>
+          <w:tcPr>
+            <w:tcW w:type="dxa" w:w="1728"/>
+          </w:tcPr>
+          <w:p>
+            <w:r>
+              <w:t>Good</w:t>
+            </w:r>
+          </w:p>
+        </w:tc>
+        <w:tc>
+          <w:tcPr>
+            <w:tcW w:type="dxa" w:w="1728"/>
+          </w:tcPr>
+          <w:p>
+            <w:r>
+              <w:t>Excellent (persistent)</w:t>
+            </w:r>
+          </w:p>
+        </w:tc>
+        <w:tc>
+          <w:tcPr>
+            <w:tcW w:type="dxa" w:w="1728"/>
+          </w:tcPr>
+          <w:p>
+            <w:r>
+              <w:t>Excellent</w:t>
+            </w:r>
+          </w:p>
+        </w:tc>
+        <w:tc>
+          <w:tcPr>
+            <w:tcW w:type="dxa" w:w="1728"/>
+          </w:tcPr>
+          <w:p>
+            <w:r>
+              <w:t>Good</w:t>
+            </w:r>
+          </w:p>
+        </w:tc>
+      </w:tr>
+      <w:tr>
+        <w:tc>
+          <w:tcPr>
+            <w:tcW w:type="dxa" w:w="1728"/>
+          </w:tcPr>
+          <w:p>
+            <w:r>
+              <w:t>Railway</w:t>
+            </w:r>
+          </w:p>
+        </w:tc>
+        <w:tc>
+          <w:tcPr>
+            <w:tcW w:type="dxa" w:w="1728"/>
+          </w:tcPr>
+          <w:p>
+            <w:r>
+              <w:t>Good</w:t>
+            </w:r>
+          </w:p>
+        </w:tc>
+        <w:tc>
+          <w:tcPr>
+            <w:tcW w:type="dxa" w:w="1728"/>
+          </w:tcPr>
+          <w:p>
+            <w:r>
+              <w:t>Good</w:t>
+            </w:r>
+          </w:p>
+        </w:tc>
+        <w:tc>
+          <w:tcPr>
+            <w:tcW w:type="dxa" w:w="1728"/>
+          </w:tcPr>
+          <w:p>
+            <w:r>
+              <w:t>Good</w:t>
+            </w:r>
+          </w:p>
+        </w:tc>
+        <w:tc>
+          <w:tcPr>
+            <w:tcW w:type="dxa" w:w="1728"/>
+          </w:tcPr>
+          <w:p>
+            <w:r>
+              <w:t>Limited free</w:t>
+            </w:r>
+          </w:p>
+        </w:tc>
+      </w:tr>
+      <w:tr>
+        <w:tc>
+          <w:tcPr>
+            <w:tcW w:type="dxa" w:w="1728"/>
+          </w:tcPr>
+          <w:p>
+            <w:r>
+              <w:t>Heroku</w:t>
+            </w:r>
+          </w:p>
+        </w:tc>
+        <w:tc>
+          <w:tcPr>
+            <w:tcW w:type="dxa" w:w="1728"/>
+          </w:tcPr>
+          <w:p>
+            <w:r>
+              <w:t>Good</w:t>
+            </w:r>
+          </w:p>
+        </w:tc>
+        <w:tc>
+          <w:tcPr>
+            <w:tcW w:type="dxa" w:w="1728"/>
+          </w:tcPr>
+          <w:p>
+            <w:r>
+              <w:t>Good</w:t>
+            </w:r>
+          </w:p>
+        </w:tc>
+        <w:tc>
+          <w:tcPr>
+            <w:tcW w:type="dxa" w:w="1728"/>
+          </w:tcPr>
+          <w:p>
+            <w:r>
+              <w:t>Good</w:t>
+            </w:r>
+          </w:p>
+        </w:tc>
+        <w:tc>
+          <w:tcPr>
+            <w:tcW w:type="dxa" w:w="1728"/>
+          </w:tcPr>
+          <w:p>
+            <w:r>
+              <w:t>No free tier</w:t>
+            </w:r>
+          </w:p>
+        </w:tc>
+      </w:tr>
+      <w:tr>
+        <w:tc>
+          <w:tcPr>
+            <w:tcW w:type="dxa" w:w="1728"/>
+          </w:tcPr>
+          <w:p>
+            <w:r>
+              <w:t>Netlify</w:t>
+            </w:r>
+          </w:p>
+        </w:tc>
+        <w:tc>
+          <w:tcPr>
+            <w:tcW w:type="dxa" w:w="1728"/>
+          </w:tcPr>
+          <w:p>
+            <w:r>
+              <w:t>Excellent</w:t>
+            </w:r>
+          </w:p>
+        </w:tc>
+        <w:tc>
+          <w:tcPr>
+            <w:tcW w:type="dxa" w:w="1728"/>
+          </w:tcPr>
+          <w:p>
+            <w:r>
+              <w:t>Limited (functions)</w:t>
+            </w:r>
+          </w:p>
+        </w:tc>
+        <w:tc>
+          <w:tcPr>
+            <w:tcW w:type="dxa" w:w="1728"/>
+          </w:tcPr>
+          <w:p>
+            <w:r>
+              <w:t>Poor</w:t>
+            </w:r>
+          </w:p>
+        </w:tc>
+        <w:tc>
+          <w:tcPr>
+            <w:tcW w:type="dxa" w:w="1728"/>
+          </w:tcPr>
+          <w:p>
+            <w:r>
+              <w:t>Generous</w:t>
+            </w:r>
+          </w:p>
+        </w:tc>
+      </w:tr>
+    </w:tbl>
+    <w:p/>
+    <w:p>
+      <w:r>
+        <w:t>Decision: Vercel for Frontend + Render for Backend</w:t>
+      </w:r>
+    </w:p>
+    <w:p/>
+    <w:p>
+      <w:pPr>
+        <w:pStyle w:val="ListNumber"/>
+      </w:pPr>
+      <w:r>
+        <w:t>**Vercel for React frontend:**</w:t>
+      </w:r>
+    </w:p>
+    <w:p>
+      <w:pPr>
+        <w:pStyle w:val="ListBullet"/>
+      </w:pPr>
+      <w:r>
+        <w:t>Instant deploys from GitHub</w:t>
+      </w:r>
+    </w:p>
+    <w:p>
+      <w:pPr>
+        <w:pStyle w:val="ListBullet"/>
+      </w:pPr>
+      <w:r>
+        <w:t>Global CDN for fast loading</w:t>
+      </w:r>
+    </w:p>
+    <w:p>
+      <w:pPr>
+        <w:pStyle w:val="ListBullet"/>
+      </w:pPr>
+      <w:r>
+        <w:t>Automatic HTTPS</w:t>
+      </w:r>
+    </w:p>
+    <w:p>
+      <w:pPr>
+        <w:pStyle w:val="ListBullet"/>
+      </w:pPr>
+      <w:r>
+        <w:t>Generous free tier (100GB bandwidth)</w:t>
+      </w:r>
+    </w:p>
+    <w:p>
+      <w:pPr>
+        <w:pStyle w:val="ListBullet"/>
+      </w:pPr>
+      <w:r>
+        <w:t>Perfect for static/SPA apps</w:t>
+      </w:r>
+    </w:p>
+    <w:p/>
+    <w:p>
+      <w:pPr>
+        <w:pStyle w:val="ListNumber"/>
+      </w:pPr>
+      <w:r>
+        <w:t>**Render for Flask backend:**</w:t>
+      </w:r>
+    </w:p>
+    <w:p>
+      <w:pPr>
+        <w:pStyle w:val="ListBullet"/>
+      </w:pPr>
+      <w:r>
+        <w:t>Native Python support with persistent processes</w:t>
+      </w:r>
+    </w:p>
+    <w:p>
+      <w:pPr>
+        <w:pStyle w:val="ListBullet"/>
+      </w:pPr>
+      <w:r>
+        <w:t>SSE streaming works without timeout issues</w:t>
+      </w:r>
+    </w:p>
+    <w:p>
+      <w:pPr>
+        <w:pStyle w:val="ListBullet"/>
+      </w:pPr>
+      <w:r>
+        <w:t>Free tier includes 750 hours/month</w:t>
+      </w:r>
+    </w:p>
+    <w:p>
+      <w:pPr>
+        <w:pStyle w:val="ListBullet"/>
+      </w:pPr>
+      <w:r>
+        <w:t>Auto-deploy from GitHub</w:t>
+      </w:r>
+    </w:p>
+    <w:p>
+      <w:pPr>
+        <w:pStyle w:val="ListBullet"/>
+      </w:pPr>
+      <w:r>
+        <w:t>Environment variables for API keys</w:t>
+      </w:r>
+    </w:p>
+    <w:p/>
+    <w:p>
+      <w:pPr>
+        <w:pStyle w:val="ListNumber"/>
+      </w:pPr>
+      <w:r>
+        <w:t>**Why not single platform?**</w:t>
+      </w:r>
+    </w:p>
+    <w:p>
+      <w:pPr>
+        <w:pStyle w:val="ListBullet"/>
+      </w:pPr>
+      <w:r>
+        <w:t>Vercel's serverless functions timeout at 10s (free) / 60s (pro) — our generation takes 75-90s</w:t>
+      </w:r>
+    </w:p>
+    <w:p>
+      <w:pPr>
+        <w:pStyle w:val="ListBullet"/>
+      </w:pPr>
+      <w:r>
+        <w:t>Render's static hosting is less optimized than Vercel's CDN</w:t>
+      </w:r>
+    </w:p>
+    <w:p>
+      <w:pPr>
+        <w:pStyle w:val="ListBullet"/>
+      </w:pPr>
+      <w:r>
+        <w:t>Split architecture matches our local dev setup (ports 3000 + 5001)</w:t>
+      </w:r>
+    </w:p>
+    <w:p/>
+    <w:p>
+      <w:pPr>
+        <w:pStyle w:val="ListNumber"/>
+      </w:pPr>
+      <w:r>
+        <w:t>**CORS Configuration:**</w:t>
+      </w:r>
+    </w:p>
+    <w:p>
+      <w:pPr>
+        <w:pStyle w:val="ListBullet"/>
+      </w:pPr>
+      <w:r>
+        <w:t>Backend allows `https://equaltales.vercel.app` origin</w:t>
+      </w:r>
+    </w:p>
+    <w:p>
+      <w:pPr>
+        <w:pStyle w:val="ListBullet"/>
+      </w:pPr>
+      <w:r>
+        <w:t>Credentials included for SSE streaming</w:t>
+      </w:r>
+    </w:p>
+    <w:p>
+      <w:pPr>
+        <w:pStyle w:val="ListBullet"/>
+      </w:pPr>
+      <w:r>
+        <w:t>Preflight caching for performance</w:t>
+      </w:r>
+    </w:p>
+    <w:p/>
+    <w:p>
       <w:r>
         <w:t>──────────────────────────────────────────────────</w:t>
       </w:r>

</xml_diff>